<commit_message>
W5 updated Sept 27 2026
</commit_message>
<xml_diff>
--- a/homework/hw05/HW05_Assignment.docx
+++ b/homework/hw05/HW05_Assignment.docx
@@ -225,7 +225,7 @@
           <w:sz w:val="22"/>
           <w:szCs w:val="22"/>
         </w:rPr>
-        <w:t xml:space="preserve">You will run the same centre-out set from four configurations spread across the workspace.</w:t>
+        <w:t xml:space="preserve">You will run the same center-out set from four configurations spread across the workspace.</w:t>
       </w:r>
     </w:p>
     <w:p>
@@ -389,7 +389,7 @@
           <w:sz w:val="26"/>
           <w:szCs w:val="26"/>
         </w:rPr>
-        <w:t xml:space="preserve">Task 1.1 — The centre-out grid, four times over (25 pts)</w:t>
+        <w:t xml:space="preserve">Task 1.1 — The center-out grid, four times over (25 pts)</w:t>
       </w:r>
     </w:p>
     <w:p>
@@ -1061,7 +1061,7 @@
                 <w:sz w:val="21"/>
                 <w:szCs w:val="21"/>
               </w:rPr>
-              <w:t xml:space="preserve">Task 1.1 — the centre-out grid</w:t>
+              <w:t xml:space="preserve">Task 1.1 — the center-out grid</w:t>
             </w:r>
           </w:p>
         </w:tc>

</xml_diff>